<commit_message>
Sales P1: sửa thuật ngữ và lỗi nội dung slide, notes, guideline sau khi rà
- Lỗi nội dung: Net Sales là tử số của AOV, ASP và mẫu số của tỷ lệ hoàn trả; bỏ Drill-through,
  Tooltip (tính năng Power BI) khỏi mục sáng tạo; Discounts là giảm giá khuyến mại trên hoá đơn,
  không phải chiết khấu thương mại; [Số cửa hàng vượt ngưỡng] đếm ô tháng × cửa hàng; "giữ đủ mọi
  dòng"; 6 bảng chiều bắt buộc + 1 bổ sung; sơ đồ 03, 04 sửa theo.
- Thuật ngữ thống nhất qua thuat_ngu.py: khuyến mại, trụ sở chính, bảng ánh xạ, độ chi tiết, quy
  online về ngày giao, Kế toán / phòng Kinh doanh / thuế GTGT trong câu văn, toàn chuỗi, luỹ kế,
  đơn đang giao; giữ "đối soát" làm từ chính.
- Văn phong: Việt hoá nhãn tiếng Anh (Nội dung, mô hình hoá dữ liệu, Loại bỏ chi tiết thừa, Hướng
  sự chú ý, biểu đồ thác nước, biểu đồ đường, Thang chấm, Câu hỏi trang cần trả lời…).

Co-Authored-By: Claude Opus 5.5 <noreply@anthropic.com>
</commit_message>
<xml_diff>
--- a/Sales/Sales Data/Project 1/Dashboard_Guideline (dành cho mentor).docx
+++ b/Sales/Sales Data/Project 1/Dashboard_Guideline (dành cho mentor).docx
@@ -398,7 +398,7 @@
               <w:rPr>
                 <w:sz w:val="18"/>
               </w:rPr>
-              <w:t>Dữ liệu đơn hàng, hàng bán bị trả lại, các bảng chiều, bảng map mã Kế toán, định nghĩa KPI, giao dịch mẫu; mỗi sheet là một Excel Table tên tbl_&lt;sheet&gt;</w:t>
+              <w:t>Dữ liệu đơn hàng, hàng bán bị trả lại, các bảng chiều, bảng ánh xạ mã Kế toán, định nghĩa KPI, giao dịch mẫu; mỗi sheet là một Excel Table tên tbl_&lt;sheet&gt;</w:t>
             </w:r>
           </w:p>
         </w:tc>
@@ -1203,7 +1203,7 @@
               <w:rPr>
                 <w:sz w:val="18"/>
               </w:rPr>
-              <w:t>USD, chưa gồm VAT; VAT giả định 10 % chỉ xuất hiện ở file Kế toán</w:t>
+              <w:t>USD, chưa gồm thuế GTGT; thuế GTGT giả định 10 % chỉ xuất hiện ở file Kế toán</w:t>
             </w:r>
           </w:p>
         </w:tc>
@@ -1620,7 +1620,7 @@
               <w:rPr>
                 <w:sz w:val="18"/>
               </w:rPr>
-              <w:t>Quan hệ lược đồ hình sao, Đánh dấu là Bảng ngày tháng (Mark as Date Table), quan hệ inactive cho delivery_date</w:t>
+              <w:t>Quan hệ lược đồ hình sao, Đánh dấu là Bảng ngày tháng (Mark as Date Table), quan hệ không hoạt động (inactive) cho delivery_date</w:t>
             </w:r>
           </w:p>
         </w:tc>
@@ -2091,7 +2091,7 @@
         </w:numPr>
       </w:pPr>
       <w:r>
-        <w:t>Tên chỉ tiêu theo Chuẩn mực kế toán VAS 14: doanh thu bán hàng (Gross Sales) − chiết khấu thương mại (Discounts) − hàng bán bị trả lại (Returns) = doanh thu thuần (Net Revenue). Bảng thuật ngữ đầy đủ ở Phụ lục B.</w:t>
+        <w:t>Tên chỉ tiêu: Gross Sales (doanh thu theo giá niêm yết) − Discounts (giảm giá khuyến mại trên hoá đơn) − Returns (hàng bán bị trả lại) = Net Revenue, tương ứng doanh thu thuần theo VAS 14. Giảm giá khuyến mại không phải chiết khấu thương mại (giảm giá cho khách mua số lượng lớn); vì giảm ngay trên hoá đơn nên kế toán ghi doanh thu theo giá đã giảm, không qua TK 521. Bảng thuật ngữ đầy đủ ở Phụ lục B.</w:t>
       </w:r>
     </w:p>
     <w:p>
@@ -2166,7 +2166,7 @@
         <w:pStyle w:val="FirstParagraph"/>
       </w:pPr>
       <w:r>
-        <w:t>Dataset gồm 2 bảng dữ kiện (fact table), 7 bảng chiều (dimension table), 1 bảng map và file Kế toán riêng. Nắm grain (mỗi dòng là gì) của từng bảng trước khi viết bất kỳ số đo nào.</w:t>
+        <w:t>Dataset gồm 2 bảng dữ kiện (fact table), 7 bảng chiều (dimension table), 1 bảng ánh xạ và file Kế toán riêng. Nắm grain (mỗi dòng là gì) của từng bảng trước khi viết bất kỳ số đo nào.</w:t>
       </w:r>
     </w:p>
     <w:p>
@@ -3596,7 +3596,7 @@
         <w:pStyle w:val="BodyText"/>
       </w:pPr>
       <w:r>
-        <w:t>Nhóm “Bắt buộc” đủ để dựng 4 trang và đối soát. Nhóm “Bổ sung” dành cho phần sáng tạo (20 điểm trong rubric), ví dụ phân tích theo vùng khách hàng hoặc quy đổi tiền tệ.</w:t>
+        <w:t>Nhóm “Bắt buộc” đủ để dựng 4 trang và đối soát. Nhóm “Bổ sung” dành cho phần sáng tạo (20 điểm trong thang chấm), ví dụ phân tích theo vùng khách hàng hoặc quy đổi tiền tệ.</w:t>
       </w:r>
     </w:p>
     <w:p>
@@ -4531,7 +4531,7 @@
         <w:rPr>
           <w:b/>
         </w:rPr>
-        <w:t>Khuyến mãi áp cho cả đơn.</w:t>
+        <w:t>Khuyến mại áp cho cả đơn.</w:t>
       </w:r>
       <w:r>
         <w:t xml:space="preserve"> discount_amount đã tính sẵn ở từng dòng = quantity × unit_price × discount_pct.</w:t>
@@ -4606,7 +4606,7 @@
         <w:t>Mã Kế toán khác store_key.</w:t>
       </w:r>
       <w:r>
-        <w:t xml:space="preserve"> Dùng map_store_finance; cửa hàng 38 (Anh) đổi mã GBR-03 → GBR-03N từ 01/07/2019, phải map theo valid_from/valid_to. Mã HQ-ADJ không thuộc cửa hàng nào.</w:t>
+        <w:t xml:space="preserve"> Dùng map_store_finance; cửa hàng 38 (Anh) đổi mã GBR-03 → GBR-03N từ 01/07/2019, phải ánh xạ theo valid_from/valid_to. Mã HQ-ADJ không thuộc cửa hàng nào.</w:t>
       </w:r>
     </w:p>
     <w:p>
@@ -4639,10 +4639,10 @@
         <w:rPr>
           <w:b/>
         </w:rPr>
-        <w:t>USD, chưa VAT.</w:t>
-      </w:r>
-      <w:r>
-        <w:t xml:space="preserve"> Mọi số tiền phía đơn hàng là USD chưa VAT; so với cột net_revenue của Kế toán, không so với total_incl_vat.</w:t>
+        <w:t>USD, chưa thuế GTGT.</w:t>
+      </w:r>
+      <w:r>
+        <w:t xml:space="preserve"> Mọi số tiền phía đơn hàng là USD chưa thuế GTGT; so với cột net_revenue của Kế toán, không so với total_incl_vat.</w:t>
       </w:r>
     </w:p>
     <w:p>
@@ -7485,7 +7485,7 @@
         <w:pStyle w:val="FirstParagraph"/>
       </w:pPr>
       <w:r>
-        <w:t xml:space="preserve">finance_raw và map_store_finance là query trung gian (chỉ tạo kết nối, không nạp vào Mô hình Dữ liệu). File Kế toán chỉ có mã cửa hàng của Kế toán (fin_store_code); fact_finance gắn store_key bằng bảng map theo </w:t>
+        <w:t xml:space="preserve">finance_raw và map_store_finance là query trung gian (chỉ tạo kết nối, không nạp vào Mô hình Dữ liệu). File Kế toán chỉ có mã cửa hàng của Kế toán (fin_store_code); fact_finance gắn store_key bằng bảng ánh xạ theo </w:t>
       </w:r>
       <w:r>
         <w:rPr>
@@ -8145,7 +8145,7 @@
         <w:pStyle w:val="BodyText"/>
       </w:pPr>
       <w:r>
-        <w:t>Kiểm tra: fact_finance có đúng 19.400 dòng như finance_raw, và đúng 3 dòng HQ-ADJ có store_key trống (giữ lại để giải thích ở tổng chuỗi, không gán cho cửa hàng nào). Với dữ liệu hiện tại bước Filtered Rows giữ nguyên số dòng: mã cũ GBR-03 chỉ có bút toán đến 27/06/2019, mã mới GBR-03N từ 01/07/2019. Bước này là chốt an toàn — nếu Kế toán còn hạch toán mã cũ sau ngày đổi, dòng đó bị loại và số dòng giảm, là tín hiệu cần hỏi lại Kế toán.</w:t>
+        <w:t>Kiểm tra: fact_finance có đúng 19.400 dòng như finance_raw, và đúng 3 dòng HQ-ADJ có store_key trống (giữ lại để giải thích ở toàn chuỗi, không gán cho cửa hàng nào). Với dữ liệu hiện tại bước Filtered Rows giữ nguyên số dòng: mã cũ GBR-03 chỉ có bút toán đến 27/06/2019, mã mới GBR-03N từ 01/07/2019. Bước này là chốt an toàn — nếu Kế toán còn hạch toán mã cũ sau ngày đổi, dòng đó bị loại và số dòng giảm, là tín hiệu cần hỏi lại Kế toán.</w:t>
       </w:r>
     </w:p>
     <w:p>
@@ -8612,7 +8612,7 @@
               <w:rPr>
                 <w:sz w:val="18"/>
               </w:rPr>
-              <w:t>Mã khuyến mãi</w:t>
+              <w:t>Mã khuyến mại</w:t>
             </w:r>
           </w:p>
         </w:tc>
@@ -10550,7 +10550,7 @@
         <w:t>21 số đo</w:t>
       </w:r>
       <w:r>
-        <w:t xml:space="preserve">, viết theo đúng thứ tự cây KPI: doanh thu → đơn hàng → Kế toán và chênh lệch → quy đổi online → so sánh kỳ. Mỗi số đo mới kiểm ngay bằng PivotTable ở sheet </w:t>
+        <w:t xml:space="preserve">, viết theo đúng thứ tự cây KPI: doanh thu → đơn hàng → Kế toán và chênh lệch → quy online về ngày giao → so sánh kỳ. Mỗi số đo mới kiểm ngay bằng PivotTable ở sheet </w:t>
       </w:r>
       <w:r>
         <w:rPr>
@@ -10808,7 +10808,7 @@
         <w:pStyle w:val="FirstParagraph"/>
       </w:pPr>
       <w:r>
-        <w:t>Gross Sales = doanh thu bán hàng; Discounts = chiết khấu thương mại; Returns = hàng bán bị trả lại; Net Revenue = doanh thu thuần (VAS 14). gross_amount đã tính ở Power Query nên chỉ cần SUM.</w:t>
+        <w:t>Gross Sales = doanh thu theo giá niêm yết; Discounts = giảm giá khuyến mại trên hoá đơn; Returns = hàng bán bị trả lại; Net Revenue = doanh thu thuần (VAS 14). gross_amount đã tính ở Power Query nên chỉ cần SUM.</w:t>
       </w:r>
     </w:p>
     <w:p>
@@ -10936,7 +10936,7 @@
         <w:pStyle w:val="Heading3"/>
       </w:pPr>
       <w:r>
-        <w:t>4.5 Nhóm Kế toán (Finance) và đối soát</w:t>
+        <w:t>4.5 Nhóm Kế toán (Kế toán) và đối soát</w:t>
       </w:r>
     </w:p>
     <w:p>
@@ -10944,7 +10944,7 @@
         <w:pStyle w:val="FirstParagraph"/>
       </w:pPr>
       <w:r>
-        <w:t>[Vượt ngưỡng] so một ô tháng × cửa hàng với ngưỡng 200 USD và 1%. [Số cửa hàng vượt ngưỡng] duyệt từng cặp tháng × cửa hàng (CROSSJOIN), nên đúng cả khi chọn một tháng lẫn cả năm. [Δ tuyệt đối] dùng để xếp bảng cửa hàng theo độ lớn chênh lệch.</w:t>
+        <w:t>[Vượt ngưỡng] so một ô tháng × cửa hàng với ngưỡng 200 USD và 1%. [Số cửa hàng vượt ngưỡng] duyệt từng ô tháng × cửa hàng (CROSSJOIN) và đếm số ô vượt ngưỡng: chọn một tháng thì bằng số cửa hàng; chọn cả năm thì một cửa hàng lệch nhiều tháng được đếm nhiều lần. [Δ tuyệt đối] dùng để xếp bảng cửa hàng theo độ lớn chênh lệch.</w:t>
       </w:r>
     </w:p>
     <w:p>
@@ -11014,7 +11014,7 @@
         <w:pStyle w:val="Heading3"/>
       </w:pPr>
       <w:r>
-        <w:t>4.6 Quy đổi online về ngày giao</w:t>
+        <w:t>4.6 Quy online về ngày giao về ngày giao</w:t>
       </w:r>
     </w:p>
     <w:p>
@@ -11526,7 +11526,7 @@
               <w:rPr>
                 <w:sz w:val="18"/>
               </w:rPr>
-              <w:t>Đường cho xu hướng; cột ngang xếp hạng cho danh mục/quốc gia; waterfall cho cầu doanh thu và phân rã Δ; bảng cho chi tiết.</w:t>
+              <w:t>Đường cho xu hướng; cột ngang xếp hạng cho danh mục/quốc gia; biểu đồ thác nước cho cầu doanh thu và phân rã Δ; bảng cho chi tiết.</w:t>
             </w:r>
           </w:p>
         </w:tc>
@@ -11543,7 +11543,7 @@
               <w:rPr>
                 <w:sz w:val="18"/>
               </w:rPr>
-              <w:t>Pie/donut/treemap để so sánh, biểu đồ hai trục y, 3D</w:t>
+              <w:t>Biểu đồ tròn, vành khuyên, dạng cây để so sánh, biểu đồ hai trục y, 3D</w:t>
             </w:r>
           </w:p>
         </w:tc>
@@ -11562,7 +11562,7 @@
               <w:rPr>
                 <w:sz w:val="18"/>
               </w:rPr>
-              <w:t>3. Gỡ rối</w:t>
+              <w:t>3. Loại bỏ chi tiết thừa</w:t>
             </w:r>
           </w:p>
         </w:tc>
@@ -11615,7 +11615,7 @@
               <w:rPr>
                 <w:sz w:val="18"/>
               </w:rPr>
-              <w:t>4. Dẫn mắt</w:t>
+              <w:t>4. Hướng sự chú ý</w:t>
             </w:r>
           </w:p>
         </w:tc>
@@ -11738,7 +11738,7 @@
               <w:rPr>
                 <w:sz w:val="18"/>
               </w:rPr>
-              <w:t>Tiêu đề hành động (“Máy tính chiếm 43% Net Sales”), mạch sheet: Tổng quan → Doanh thu đến từ đâu → Đối soát → Hoàn trả; chân trang ghi nguồn, as-of, quy ước Δ.</w:t>
+              <w:t>Tiêu đề hành động (“Máy tính chiếm 43% Net Sales”), mạch sheet: Tổng quan → Doanh thu đến từ đâu → Đối soát → Hoàn trả; chân trang ghi nguồn, ngày chốt dữ liệu, quy ước Δ.</w:t>
             </w:r>
           </w:p>
         </w:tc>
@@ -13029,7 +13029,7 @@
               <w:rPr>
                 <w:sz w:val="18"/>
               </w:rPr>
-              <w:t>Waterfall</w:t>
+              <w:t>biểu đồ thác nước</w:t>
             </w:r>
           </w:p>
         </w:tc>
@@ -14039,7 +14039,7 @@
               <w:rPr>
                 <w:sz w:val="18"/>
               </w:rPr>
-              <w:t>Waterfall</w:t>
+              <w:t>biểu đồ thác nước</w:t>
             </w:r>
           </w:p>
         </w:tc>
@@ -14772,7 +14772,7 @@
               <w:rPr>
                 <w:sz w:val="18"/>
               </w:rPr>
-              <w:t>Huỷ và chờ giao</w:t>
+              <w:t>Huỷ và đang giao</w:t>
             </w:r>
           </w:p>
         </w:tc>
@@ -16239,7 +16239,7 @@
         <w:pStyle w:val="Heading3"/>
       </w:pPr>
       <w:r>
-        <w:t>6.2 Lũy kế năm 2020 so với 2019</w:t>
+        <w:t>6.2 Luỹ kế năm 2020 so với 2019</w:t>
       </w:r>
     </w:p>
     <w:tbl>
@@ -17183,7 +17183,7 @@
               <w:rPr>
                 <w:sz w:val="18"/>
               </w:rPr>
-              <w:t>+ Doanh thu gồm VAT</w:t>
+              <w:t>+ Doanh thu gồm thuế GTGT</w:t>
             </w:r>
           </w:p>
         </w:tc>
@@ -20648,7 +20648,7 @@
               <w:rPr>
                 <w:sz w:val="18"/>
               </w:rPr>
-              <w:t>Doanh thu gồm VAT</w:t>
+              <w:t>Doanh thu gồm thuế GTGT</w:t>
             </w:r>
           </w:p>
         </w:tc>
@@ -21799,7 +21799,7 @@
               <w:rPr>
                 <w:sz w:val="18"/>
               </w:rPr>
-              <w:t>Doanh thu gồm VAT (K27)</w:t>
+              <w:t>Doanh thu gồm thuế GTGT (K27)</w:t>
             </w:r>
           </w:p>
         </w:tc>
@@ -21852,7 +21852,7 @@
               <w:rPr>
                 <w:sz w:val="18"/>
               </w:rPr>
-              <w:t>Cả tháng 06/2020 cửa hàng ghi revenue_recognized đã gồm VAT 10 %</w:t>
+              <w:t>Cả tháng 06/2020 cửa hàng ghi revenue_recognized đã gồm thuế GTGT 10 %</w:t>
             </w:r>
           </w:p>
         </w:tc>
@@ -22032,7 +22032,7 @@
         </w:numPr>
       </w:pPr>
       <w:r>
-        <w:t>Chọn tháng 06/2020, quốc gia Mỹ: 2 cửa hàng vượt ngưỡng (S54 do VAT, S45 do đơn huỷ được ghi nhận).</w:t>
+        <w:t>Chọn tháng 06/2020, quốc gia Mỹ: 2 cửa hàng vượt ngưỡng (S54 do thuế GTGT, S45 do đơn huỷ được ghi nhận).</w:t>
       </w:r>
     </w:p>
     <w:p>
@@ -22427,7 +22427,7 @@
         <w:t>Limitation</w:t>
       </w:r>
       <w:r>
-        <w:t xml:space="preserve"> (giới hạn): “Dữ liệu là giả lập trên nền GER; VAT giả định 10 % thống nhất; chưa xét tỷ giá.”</w:t>
+        <w:t xml:space="preserve"> (giới hạn): “Dữ liệu là giả lập trên nền GER; thuế GTGT giả định 10 % thống nhất; chưa xét tỷ giá.”</w:t>
       </w:r>
     </w:p>
     <w:p>
@@ -22459,7 +22459,7 @@
         </w:numPr>
       </w:pPr>
       <w:r>
-        <w:t>Waterfall cầu nối Orders → Kế toán theo nguyên nhân, tách thêm từng cửa hàng ⚠ (ô CUBEVALUE cho từng cửa hàng hoặc bảng nguyên nhân dựng bằng Power Query).</w:t>
+        <w:t>biểu đồ thác nước cầu nối Orders → Kế toán theo nguyên nhân, tách thêm từng cửa hàng ⚠ (ô CUBEVALUE cho từng cửa hàng hoặc bảng nguyên nhân dựng bằng Power Query).</w:t>
       </w:r>
     </w:p>
     <w:p>
@@ -22471,7 +22471,7 @@
         </w:numPr>
       </w:pPr>
       <w:r>
-        <w:t>Phân tích khuyến mãi: Net Sales và AOV theo promo_code; giảm giá có kéo số đơn lên không.</w:t>
+        <w:t>Phân tích khuyến mại: Net Sales và AOV theo promo_code; giảm giá có kéo số đơn lên không.</w:t>
       </w:r>
     </w:p>
     <w:p>
@@ -22724,7 +22724,7 @@
               <w:rPr>
                 <w:sz w:val="18"/>
               </w:rPr>
-              <w:t>4 · Quy đổi online về ngày giao</w:t>
+              <w:t>4 · Quy online về ngày giao về ngày giao</w:t>
             </w:r>
           </w:p>
         </w:tc>
@@ -23329,7 +23329,7 @@
               <w:rPr>
                 <w:sz w:val="18"/>
               </w:rPr>
-              <w:t>doanh thu bán hàng</w:t>
+              <w:t>doanh thu theo giá niêm yết (trước giảm giá)</w:t>
             </w:r>
           </w:p>
         </w:tc>
@@ -23363,7 +23363,7 @@
               <w:rPr>
                 <w:sz w:val="18"/>
               </w:rPr>
-              <w:t>VAS 14; mẫu B02-DN</w:t>
+              <w:t>chỉ tiêu quản trị</w:t>
             </w:r>
           </w:p>
         </w:tc>
@@ -23399,7 +23399,7 @@
               <w:rPr>
                 <w:sz w:val="18"/>
               </w:rPr>
-              <w:t>các khoản giảm trừ doanh thu</w:t>
+              <w:t>giảm giá khuyến mại trên hoá đơn (chỉ tiêu quản trị; kế toán ghi doanh thu theo giá đã giảm)</w:t>
             </w:r>
           </w:p>
         </w:tc>
@@ -23416,7 +23416,7 @@
               <w:rPr>
                 <w:sz w:val="18"/>
               </w:rPr>
-              <w:t>Revenue deductions</w:t>
+              <w:t>Discounts</w:t>
             </w:r>
           </w:p>
         </w:tc>
@@ -23433,7 +23433,7 @@
               <w:rPr>
                 <w:sz w:val="18"/>
               </w:rPr>
-              <w:t>TK 521, TT 99/2025/TT-BTC</w:t>
+              <w:t>VAS 14; TK 521, TT 99/2025/TT-BTC</w:t>
             </w:r>
           </w:p>
         </w:tc>
@@ -23469,7 +23469,7 @@
               <w:rPr>
                 <w:sz w:val="18"/>
               </w:rPr>
-              <w:t>chiết khấu thương mại (khuyến mãi giảm giá trên hoá đơn)</w:t>
+              <w:t>hàng bán bị trả lại</w:t>
             </w:r>
           </w:p>
         </w:tc>
@@ -23486,7 +23486,7 @@
               <w:rPr>
                 <w:sz w:val="18"/>
               </w:rPr>
-              <w:t>Discounts</w:t>
+              <w:t>Returns</w:t>
             </w:r>
           </w:p>
         </w:tc>
@@ -23539,7 +23539,7 @@
               <w:rPr>
                 <w:sz w:val="18"/>
               </w:rPr>
-              <w:t>hàng bán bị trả lại</w:t>
+              <w:t>doanh thu sau chiết khấu (chỉ tiêu trung gian)</w:t>
             </w:r>
           </w:p>
         </w:tc>
@@ -23556,7 +23556,7 @@
               <w:rPr>
                 <w:sz w:val="18"/>
               </w:rPr>
-              <w:t>Returns</w:t>
+              <w:t>Net Sales</w:t>
             </w:r>
           </w:p>
         </w:tc>
@@ -23573,7 +23573,7 @@
               <w:rPr>
                 <w:sz w:val="18"/>
               </w:rPr>
-              <w:t>VAS 14</w:t>
+              <w:t>chỉ tiêu quản trị</w:t>
             </w:r>
           </w:p>
         </w:tc>
@@ -23609,7 +23609,7 @@
               <w:rPr>
                 <w:sz w:val="18"/>
               </w:rPr>
-              <w:t>doanh thu sau chiết khấu (chỉ tiêu trung gian)</w:t>
+              <w:t>doanh thu thuần</w:t>
             </w:r>
           </w:p>
         </w:tc>
@@ -23626,7 +23626,7 @@
               <w:rPr>
                 <w:sz w:val="18"/>
               </w:rPr>
-              <w:t>Net Sales</w:t>
+              <w:t>Net Revenue</w:t>
             </w:r>
           </w:p>
         </w:tc>
@@ -23643,6 +23643,496 @@
               <w:rPr>
                 <w:sz w:val="18"/>
               </w:rPr>
+              <w:t>VAS 14; TT 99/2025/TT-BTC</w:t>
+            </w:r>
+          </w:p>
+        </w:tc>
+      </w:tr>
+      <w:tr>
+        <w:tc>
+          <w:tcPr>
+            <w:tcW w:type="dxa" w:w="1134"/>
+          </w:tcPr>
+          <w:p>
+            <w:pPr>
+              <w:pStyle w:val="Compact"/>
+              <w:spacing w:before="20" w:after="20"/>
+            </w:pPr>
+            <w:r>
+              <w:rPr>
+                <w:sz w:val="18"/>
+              </w:rPr>
+              <w:t>Doanh thu</w:t>
+            </w:r>
+          </w:p>
+        </w:tc>
+        <w:tc>
+          <w:tcPr>
+            <w:tcW w:type="dxa" w:w="3572"/>
+          </w:tcPr>
+          <w:p>
+            <w:pPr>
+              <w:pStyle w:val="Compact"/>
+              <w:spacing w:before="20" w:after="20"/>
+            </w:pPr>
+            <w:r>
+              <w:rPr>
+                <w:sz w:val="18"/>
+              </w:rPr>
+              <w:t>ghi nhận doanh thu · ngày ghi sổ</w:t>
+            </w:r>
+          </w:p>
+        </w:tc>
+        <w:tc>
+          <w:tcPr>
+            <w:tcW w:type="dxa" w:w="3061"/>
+          </w:tcPr>
+          <w:p>
+            <w:pPr>
+              <w:pStyle w:val="Compact"/>
+              <w:spacing w:before="20" w:after="20"/>
+            </w:pPr>
+            <w:r>
+              <w:rPr>
+                <w:sz w:val="18"/>
+              </w:rPr>
+              <w:t>Revenue recognition · posting_date</w:t>
+            </w:r>
+          </w:p>
+        </w:tc>
+        <w:tc>
+          <w:tcPr>
+            <w:tcW w:type="dxa" w:w="2154"/>
+          </w:tcPr>
+          <w:p>
+            <w:pPr>
+              <w:pStyle w:val="Compact"/>
+              <w:spacing w:before="20" w:after="20"/>
+            </w:pPr>
+            <w:r>
+              <w:rPr>
+                <w:sz w:val="18"/>
+              </w:rPr>
+              <w:t>VAS 14; sổ Nhật ký chung</w:t>
+            </w:r>
+          </w:p>
+        </w:tc>
+      </w:tr>
+      <w:tr>
+        <w:tc>
+          <w:tcPr>
+            <w:tcW w:type="dxa" w:w="1134"/>
+          </w:tcPr>
+          <w:p>
+            <w:pPr>
+              <w:pStyle w:val="Compact"/>
+              <w:spacing w:before="20" w:after="20"/>
+            </w:pPr>
+            <w:r>
+              <w:rPr>
+                <w:sz w:val="18"/>
+              </w:rPr>
+              <w:t>Doanh thu</w:t>
+            </w:r>
+          </w:p>
+        </w:tc>
+        <w:tc>
+          <w:tcPr>
+            <w:tcW w:type="dxa" w:w="3572"/>
+          </w:tcPr>
+          <w:p>
+            <w:pPr>
+              <w:pStyle w:val="Compact"/>
+              <w:spacing w:before="20" w:after="20"/>
+            </w:pPr>
+            <w:r>
+              <w:rPr>
+                <w:sz w:val="18"/>
+              </w:rPr>
+              <w:t>bút toán điều chỉnh · khoá sổ cuối tháng</w:t>
+            </w:r>
+          </w:p>
+        </w:tc>
+        <w:tc>
+          <w:tcPr>
+            <w:tcW w:type="dxa" w:w="3061"/>
+          </w:tcPr>
+          <w:p>
+            <w:pPr>
+              <w:pStyle w:val="Compact"/>
+              <w:spacing w:before="20" w:after="20"/>
+            </w:pPr>
+            <w:r>
+              <w:rPr>
+                <w:sz w:val="18"/>
+              </w:rPr>
+              <w:t>Manual adjustment (HQ-ADJ) · month-end close</w:t>
+            </w:r>
+          </w:p>
+        </w:tc>
+        <w:tc>
+          <w:tcPr>
+            <w:tcW w:type="dxa" w:w="2154"/>
+          </w:tcPr>
+          <w:p>
+            <w:pPr>
+              <w:pStyle w:val="Compact"/>
+              <w:spacing w:before="20" w:after="20"/>
+            </w:pPr>
+            <w:r>
+              <w:rPr>
+                <w:sz w:val="18"/>
+              </w:rPr>
+              <w:t>chế độ kế toán</w:t>
+            </w:r>
+          </w:p>
+        </w:tc>
+      </w:tr>
+      <w:tr>
+        <w:tc>
+          <w:tcPr>
+            <w:tcW w:type="dxa" w:w="1134"/>
+          </w:tcPr>
+          <w:p>
+            <w:pPr>
+              <w:pStyle w:val="Compact"/>
+              <w:spacing w:before="20" w:after="20"/>
+            </w:pPr>
+            <w:r>
+              <w:rPr>
+                <w:sz w:val="18"/>
+              </w:rPr>
+              <w:t>Doanh thu</w:t>
+            </w:r>
+          </w:p>
+        </w:tc>
+        <w:tc>
+          <w:tcPr>
+            <w:tcW w:type="dxa" w:w="3572"/>
+          </w:tcPr>
+          <w:p>
+            <w:pPr>
+              <w:pStyle w:val="Compact"/>
+              <w:spacing w:before="20" w:after="20"/>
+            </w:pPr>
+            <w:r>
+              <w:rPr>
+                <w:sz w:val="18"/>
+              </w:rPr>
+              <w:t>thuế GTGT</w:t>
+            </w:r>
+          </w:p>
+        </w:tc>
+        <w:tc>
+          <w:tcPr>
+            <w:tcW w:type="dxa" w:w="3061"/>
+          </w:tcPr>
+          <w:p>
+            <w:pPr>
+              <w:pStyle w:val="Compact"/>
+              <w:spacing w:before="20" w:after="20"/>
+            </w:pPr>
+            <w:r>
+              <w:rPr>
+                <w:sz w:val="18"/>
+              </w:rPr>
+              <w:t>VAT</w:t>
+            </w:r>
+          </w:p>
+        </w:tc>
+        <w:tc>
+          <w:tcPr>
+            <w:tcW w:type="dxa" w:w="2154"/>
+          </w:tcPr>
+          <w:p>
+            <w:pPr>
+              <w:pStyle w:val="Compact"/>
+              <w:spacing w:before="20" w:after="20"/>
+            </w:pPr>
+            <w:r>
+              <w:rPr>
+                <w:sz w:val="18"/>
+              </w:rPr>
+              <w:t>Luật Thuế GTGT</w:t>
+            </w:r>
+          </w:p>
+        </w:tc>
+      </w:tr>
+      <w:tr>
+        <w:tc>
+          <w:tcPr>
+            <w:tcW w:type="dxa" w:w="1134"/>
+          </w:tcPr>
+          <w:p>
+            <w:pPr>
+              <w:pStyle w:val="Compact"/>
+              <w:spacing w:before="20" w:after="20"/>
+            </w:pPr>
+            <w:r>
+              <w:rPr>
+                <w:sz w:val="18"/>
+              </w:rPr>
+              <w:t>Chỉ tiêu</w:t>
+            </w:r>
+          </w:p>
+        </w:tc>
+        <w:tc>
+          <w:tcPr>
+            <w:tcW w:type="dxa" w:w="3572"/>
+          </w:tcPr>
+          <w:p>
+            <w:pPr>
+              <w:pStyle w:val="Compact"/>
+              <w:spacing w:before="20" w:after="20"/>
+            </w:pPr>
+            <w:r>
+              <w:rPr>
+                <w:sz w:val="18"/>
+              </w:rPr>
+              <w:t>chỉ số hiệu suất then chốt</w:t>
+            </w:r>
+          </w:p>
+        </w:tc>
+        <w:tc>
+          <w:tcPr>
+            <w:tcW w:type="dxa" w:w="3061"/>
+          </w:tcPr>
+          <w:p>
+            <w:pPr>
+              <w:pStyle w:val="Compact"/>
+              <w:spacing w:before="20" w:after="20"/>
+            </w:pPr>
+            <w:r>
+              <w:rPr>
+                <w:sz w:val="18"/>
+              </w:rPr>
+              <w:t>KPI</w:t>
+            </w:r>
+          </w:p>
+        </w:tc>
+        <w:tc>
+          <w:tcPr>
+            <w:tcW w:type="dxa" w:w="2154"/>
+          </w:tcPr>
+          <w:p>
+            <w:pPr>
+              <w:pStyle w:val="Compact"/>
+              <w:spacing w:before="20" w:after="20"/>
+            </w:pPr>
+            <w:r>
+              <w:rPr>
+                <w:sz w:val="18"/>
+              </w:rPr>
+              <w:t>Microsoft vi-vn (Power Pivot KPI)</w:t>
+            </w:r>
+          </w:p>
+        </w:tc>
+      </w:tr>
+      <w:tr>
+        <w:tc>
+          <w:tcPr>
+            <w:tcW w:type="dxa" w:w="1134"/>
+          </w:tcPr>
+          <w:p>
+            <w:pPr>
+              <w:pStyle w:val="Compact"/>
+              <w:spacing w:before="20" w:after="20"/>
+            </w:pPr>
+            <w:r>
+              <w:rPr>
+                <w:sz w:val="18"/>
+              </w:rPr>
+              <w:t>Chỉ tiêu</w:t>
+            </w:r>
+          </w:p>
+        </w:tc>
+        <w:tc>
+          <w:tcPr>
+            <w:tcW w:type="dxa" w:w="3572"/>
+          </w:tcPr>
+          <w:p>
+            <w:pPr>
+              <w:pStyle w:val="Compact"/>
+              <w:spacing w:before="20" w:after="20"/>
+            </w:pPr>
+            <w:r>
+              <w:rPr>
+                <w:sz w:val="18"/>
+              </w:rPr>
+              <w:t>giá trị đơn hàng trung bình</w:t>
+            </w:r>
+          </w:p>
+        </w:tc>
+        <w:tc>
+          <w:tcPr>
+            <w:tcW w:type="dxa" w:w="3061"/>
+          </w:tcPr>
+          <w:p>
+            <w:pPr>
+              <w:pStyle w:val="Compact"/>
+              <w:spacing w:before="20" w:after="20"/>
+            </w:pPr>
+            <w:r>
+              <w:rPr>
+                <w:sz w:val="18"/>
+              </w:rPr>
+              <w:t>AOV</w:t>
+            </w:r>
+          </w:p>
+        </w:tc>
+        <w:tc>
+          <w:tcPr>
+            <w:tcW w:type="dxa" w:w="2154"/>
+          </w:tcPr>
+          <w:p>
+            <w:pPr>
+              <w:pStyle w:val="Compact"/>
+              <w:spacing w:before="20" w:after="20"/>
+            </w:pPr>
+            <w:r>
+              <w:rPr>
+                <w:sz w:val="18"/>
+              </w:rPr>
+              <w:t>thực tế bán lẻ</w:t>
+            </w:r>
+          </w:p>
+        </w:tc>
+      </w:tr>
+      <w:tr>
+        <w:tc>
+          <w:tcPr>
+            <w:tcW w:type="dxa" w:w="1134"/>
+          </w:tcPr>
+          <w:p>
+            <w:pPr>
+              <w:pStyle w:val="Compact"/>
+              <w:spacing w:before="20" w:after="20"/>
+            </w:pPr>
+            <w:r>
+              <w:rPr>
+                <w:sz w:val="18"/>
+              </w:rPr>
+              <w:t>Chỉ tiêu</w:t>
+            </w:r>
+          </w:p>
+        </w:tc>
+        <w:tc>
+          <w:tcPr>
+            <w:tcW w:type="dxa" w:w="3572"/>
+          </w:tcPr>
+          <w:p>
+            <w:pPr>
+              <w:pStyle w:val="Compact"/>
+              <w:spacing w:before="20" w:after="20"/>
+            </w:pPr>
+            <w:r>
+              <w:rPr>
+                <w:sz w:val="18"/>
+              </w:rPr>
+              <w:t>giá bán bình quân</w:t>
+            </w:r>
+          </w:p>
+        </w:tc>
+        <w:tc>
+          <w:tcPr>
+            <w:tcW w:type="dxa" w:w="3061"/>
+          </w:tcPr>
+          <w:p>
+            <w:pPr>
+              <w:pStyle w:val="Compact"/>
+              <w:spacing w:before="20" w:after="20"/>
+            </w:pPr>
+            <w:r>
+              <w:rPr>
+                <w:sz w:val="18"/>
+              </w:rPr>
+              <w:t>ASP</w:t>
+            </w:r>
+          </w:p>
+        </w:tc>
+        <w:tc>
+          <w:tcPr>
+            <w:tcW w:type="dxa" w:w="2154"/>
+          </w:tcPr>
+          <w:p>
+            <w:pPr>
+              <w:pStyle w:val="Compact"/>
+              <w:spacing w:before="20" w:after="20"/>
+            </w:pPr>
+            <w:r>
+              <w:rPr>
+                <w:sz w:val="18"/>
+              </w:rPr>
+              <w:t>thực tế bán lẻ</w:t>
+            </w:r>
+          </w:p>
+        </w:tc>
+      </w:tr>
+      <w:tr>
+        <w:tc>
+          <w:tcPr>
+            <w:tcW w:type="dxa" w:w="1134"/>
+          </w:tcPr>
+          <w:p>
+            <w:pPr>
+              <w:pStyle w:val="Compact"/>
+              <w:spacing w:before="20" w:after="20"/>
+            </w:pPr>
+            <w:r>
+              <w:rPr>
+                <w:sz w:val="18"/>
+              </w:rPr>
+              <w:t>Chỉ tiêu</w:t>
+            </w:r>
+          </w:p>
+        </w:tc>
+        <w:tc>
+          <w:tcPr>
+            <w:tcW w:type="dxa" w:w="3572"/>
+          </w:tcPr>
+          <w:p>
+            <w:pPr>
+              <w:pStyle w:val="Compact"/>
+              <w:spacing w:before="20" w:after="20"/>
+            </w:pPr>
+            <w:r>
+              <w:rPr>
+                <w:sz w:val="18"/>
+              </w:rPr>
+              <w:t>tỷ lệ hàng bán bị trả lại</w:t>
+            </w:r>
+          </w:p>
+        </w:tc>
+        <w:tc>
+          <w:tcPr>
+            <w:tcW w:type="dxa" w:w="3061"/>
+          </w:tcPr>
+          <w:p>
+            <w:pPr>
+              <w:pStyle w:val="Compact"/>
+              <w:spacing w:before="20" w:after="20"/>
+            </w:pPr>
+            <w:r>
+              <w:rPr>
+                <w:sz w:val="18"/>
+              </w:rPr>
+              <w:t>Return Rate</w:t>
+            </w:r>
+          </w:p>
+        </w:tc>
+        <w:tc>
+          <w:tcPr>
+            <w:tcW w:type="dxa" w:w="2154"/>
+          </w:tcPr>
+          <w:p>
+            <w:pPr>
+              <w:pStyle w:val="Compact"/>
+              <w:spacing w:before="20" w:after="20"/>
+            </w:pPr>
+            <w:r>
+              <w:rPr>
+                <w:sz w:val="18"/>
+              </w:rPr>
               <w:t>chỉ tiêu quản trị</w:t>
             </w:r>
           </w:p>
@@ -23662,7 +24152,7 @@
               <w:rPr>
                 <w:sz w:val="18"/>
               </w:rPr>
-              <w:t>Doanh thu</w:t>
+              <w:t>Chỉ tiêu</w:t>
             </w:r>
           </w:p>
         </w:tc>
@@ -23679,7 +24169,7 @@
               <w:rPr>
                 <w:sz w:val="18"/>
               </w:rPr>
-              <w:t>doanh thu thuần</w:t>
+              <w:t>so với tháng trước · cùng kỳ năm trước · luỹ kế từ đầu năm</w:t>
             </w:r>
           </w:p>
         </w:tc>
@@ -23696,7 +24186,7 @@
               <w:rPr>
                 <w:sz w:val="18"/>
               </w:rPr>
-              <w:t>Net Revenue</w:t>
+              <w:t>LM · SPLY · YTD</w:t>
             </w:r>
           </w:p>
         </w:tc>
@@ -23713,7 +24203,7 @@
               <w:rPr>
                 <w:sz w:val="18"/>
               </w:rPr>
-              <w:t>VAS 14; TT 99/2025/TT-BTC</w:t>
+              <w:t>mẫu B02-DN (luỹ kế)</w:t>
             </w:r>
           </w:p>
         </w:tc>
@@ -23732,7 +24222,7 @@
               <w:rPr>
                 <w:sz w:val="18"/>
               </w:rPr>
-              <w:t>Doanh thu</w:t>
+              <w:t>Chỉ tiêu</w:t>
             </w:r>
           </w:p>
         </w:tc>
@@ -23749,7 +24239,7 @@
               <w:rPr>
                 <w:sz w:val="18"/>
               </w:rPr>
-              <w:t>ghi nhận doanh thu · ngày ghi sổ</w:t>
+              <w:t>chênh lệch · ngưỡng · đối soát (đối chiếu số liệu)</w:t>
             </w:r>
           </w:p>
         </w:tc>
@@ -23766,7 +24256,7 @@
               <w:rPr>
                 <w:sz w:val="18"/>
               </w:rPr>
-              <w:t>Revenue recognition · posting_date</w:t>
+              <w:t>Δ · threshold · reconciliation</w:t>
             </w:r>
           </w:p>
         </w:tc>
@@ -23783,7 +24273,7 @@
               <w:rPr>
                 <w:sz w:val="18"/>
               </w:rPr>
-              <w:t>VAS 14; sổ Nhật ký chung</w:t>
+              <w:t>thực tế kế toán</w:t>
             </w:r>
           </w:p>
         </w:tc>
@@ -23802,7 +24292,7 @@
               <w:rPr>
                 <w:sz w:val="18"/>
               </w:rPr>
-              <w:t>Doanh thu</w:t>
+              <w:t>Excel</w:t>
             </w:r>
           </w:p>
         </w:tc>
@@ -23819,7 +24309,7 @@
               <w:rPr>
                 <w:sz w:val="18"/>
               </w:rPr>
-              <w:t>bút toán điều chỉnh · khoá sổ cuối tháng</w:t>
+              <w:t>Mô hình Dữ liệu</w:t>
             </w:r>
           </w:p>
         </w:tc>
@@ -23836,7 +24326,7 @@
               <w:rPr>
                 <w:sz w:val="18"/>
               </w:rPr>
-              <w:t>Manual adjustment (HQ-ADJ) · month-end close</w:t>
+              <w:t>Data Model</w:t>
             </w:r>
           </w:p>
         </w:tc>
@@ -23853,7 +24343,7 @@
               <w:rPr>
                 <w:sz w:val="18"/>
               </w:rPr>
-              <w:t>chế độ kế toán</w:t>
+              <w:t>Microsoft vi-vn</w:t>
             </w:r>
           </w:p>
         </w:tc>
@@ -23872,7 +24362,7 @@
               <w:rPr>
                 <w:sz w:val="18"/>
               </w:rPr>
-              <w:t>Doanh thu</w:t>
+              <w:t>Excel</w:t>
             </w:r>
           </w:p>
         </w:tc>
@@ -23889,7 +24379,7 @@
               <w:rPr>
                 <w:sz w:val="18"/>
               </w:rPr>
-              <w:t>thuế GTGT</w:t>
+              <w:t>số đo</w:t>
             </w:r>
           </w:p>
         </w:tc>
@@ -23906,7 +24396,7 @@
               <w:rPr>
                 <w:sz w:val="18"/>
               </w:rPr>
-              <w:t>VAT</w:t>
+              <w:t>measure</w:t>
             </w:r>
           </w:p>
         </w:tc>
@@ -23923,7 +24413,7 @@
               <w:rPr>
                 <w:sz w:val="18"/>
               </w:rPr>
-              <w:t>Luật Thuế GTGT</w:t>
+              <w:t>Microsoft vi-vn (Power Pivot)</w:t>
             </w:r>
           </w:p>
         </w:tc>
@@ -23942,7 +24432,7 @@
               <w:rPr>
                 <w:sz w:val="18"/>
               </w:rPr>
-              <w:t>Chỉ tiêu</w:t>
+              <w:t>Excel</w:t>
             </w:r>
           </w:p>
         </w:tc>
@@ -23959,7 +24449,7 @@
               <w:rPr>
                 <w:sz w:val="18"/>
               </w:rPr>
-              <w:t>chỉ số hiệu suất then chốt</w:t>
+              <w:t>mối quan hệ · Dạng xem Sơ đồ · Quản lý Quan hệ</w:t>
             </w:r>
           </w:p>
         </w:tc>
@@ -23976,7 +24466,7 @@
               <w:rPr>
                 <w:sz w:val="18"/>
               </w:rPr>
-              <w:t>KPI</w:t>
+              <w:t>relationship · Diagram View · Manage Relationships</w:t>
             </w:r>
           </w:p>
         </w:tc>
@@ -23993,7 +24483,7 @@
               <w:rPr>
                 <w:sz w:val="18"/>
               </w:rPr>
-              <w:t>Microsoft vi-vn (Power Pivot KPI)</w:t>
+              <w:t>Microsoft vi-vn</w:t>
             </w:r>
           </w:p>
         </w:tc>
@@ -24012,7 +24502,7 @@
               <w:rPr>
                 <w:sz w:val="18"/>
               </w:rPr>
-              <w:t>Chỉ tiêu</w:t>
+              <w:t>Excel</w:t>
             </w:r>
           </w:p>
         </w:tc>
@@ -24029,7 +24519,7 @@
               <w:rPr>
                 <w:sz w:val="18"/>
               </w:rPr>
-              <w:t>giá trị đơn hàng trung bình</w:t>
+              <w:t>Đánh dấu là Bảng ngày tháng</w:t>
             </w:r>
           </w:p>
         </w:tc>
@@ -24046,7 +24536,7 @@
               <w:rPr>
                 <w:sz w:val="18"/>
               </w:rPr>
-              <w:t>AOV</w:t>
+              <w:t>Mark as Date Table</w:t>
             </w:r>
           </w:p>
         </w:tc>
@@ -24063,7 +24553,7 @@
               <w:rPr>
                 <w:sz w:val="18"/>
               </w:rPr>
-              <w:t>thực tế bán lẻ</w:t>
+              <w:t>Microsoft vi-vn</w:t>
             </w:r>
           </w:p>
         </w:tc>
@@ -24082,7 +24572,7 @@
               <w:rPr>
                 <w:sz w:val="18"/>
               </w:rPr>
-              <w:t>Chỉ tiêu</w:t>
+              <w:t>Excel</w:t>
             </w:r>
           </w:p>
         </w:tc>
@@ -24099,7 +24589,7 @@
               <w:rPr>
                 <w:sz w:val="18"/>
               </w:rPr>
-              <w:t>giá bán bình quân</w:t>
+              <w:t>Đóng &amp; Tải Tới · Làm mới Tất cả</w:t>
             </w:r>
           </w:p>
         </w:tc>
@@ -24116,7 +24606,7 @@
               <w:rPr>
                 <w:sz w:val="18"/>
               </w:rPr>
-              <w:t>ASP</w:t>
+              <w:t>Close &amp; Load To · Refresh All</w:t>
             </w:r>
           </w:p>
         </w:tc>
@@ -24133,7 +24623,7 @@
               <w:rPr>
                 <w:sz w:val="18"/>
               </w:rPr>
-              <w:t>thực tế bán lẻ</w:t>
+              <w:t>Microsoft vi-vn</w:t>
             </w:r>
           </w:p>
         </w:tc>
@@ -24152,7 +24642,7 @@
               <w:rPr>
                 <w:sz w:val="18"/>
               </w:rPr>
-              <w:t>Chỉ tiêu</w:t>
+              <w:t>Excel</w:t>
             </w:r>
           </w:p>
         </w:tc>
@@ -24169,7 +24659,7 @@
               <w:rPr>
                 <w:sz w:val="18"/>
               </w:rPr>
-              <w:t>tỷ lệ hàng bán bị trả lại</w:t>
+              <w:t>Định dạng có Điều kiện · Đường lưới · bổ trợ</w:t>
             </w:r>
           </w:p>
         </w:tc>
@@ -24186,7 +24676,7 @@
               <w:rPr>
                 <w:sz w:val="18"/>
               </w:rPr>
-              <w:t>Return Rate</w:t>
+              <w:t>Conditional Formatting · Gridlines · add-in</w:t>
             </w:r>
           </w:p>
         </w:tc>
@@ -24203,7 +24693,7 @@
               <w:rPr>
                 <w:sz w:val="18"/>
               </w:rPr>
-              <w:t>VAS 14 + thực tế</w:t>
+              <w:t>Microsoft vi-vn</w:t>
             </w:r>
           </w:p>
         </w:tc>
@@ -24222,7 +24712,7 @@
               <w:rPr>
                 <w:sz w:val="18"/>
               </w:rPr>
-              <w:t>Chỉ tiêu</w:t>
+              <w:t>Excel</w:t>
             </w:r>
           </w:p>
         </w:tc>
@@ -24239,7 +24729,7 @@
               <w:rPr>
                 <w:sz w:val="18"/>
               </w:rPr>
-              <w:t>so với tháng trước · cùng kỳ năm trước · luỹ kế từ đầu năm</w:t>
+              <w:t>giữ tên tiếng Anh</w:t>
             </w:r>
           </w:p>
         </w:tc>
@@ -24256,7 +24746,7 @@
               <w:rPr>
                 <w:sz w:val="18"/>
               </w:rPr>
-              <w:t>LM · SPLY · YTD</w:t>
+              <w:t>PivotTable · PivotChart · Slicer · Power Query · Power Pivot · CUBEVALUE</w:t>
             </w:r>
           </w:p>
         </w:tc>
@@ -24273,7 +24763,7 @@
               <w:rPr>
                 <w:sz w:val="18"/>
               </w:rPr>
-              <w:t>mẫu B02-DN (luỹ kế)</w:t>
+              <w:t>Microsoft vi-vn</w:t>
             </w:r>
           </w:p>
         </w:tc>
@@ -24292,7 +24782,7 @@
               <w:rPr>
                 <w:sz w:val="18"/>
               </w:rPr>
-              <w:t>Chỉ tiêu</w:t>
+              <w:t>Excel</w:t>
             </w:r>
           </w:p>
         </w:tc>
@@ -24309,7 +24799,7 @@
               <w:rPr>
                 <w:sz w:val="18"/>
               </w:rPr>
-              <w:t>chênh lệch · ngưỡng · đối soát (đối chiếu số liệu)</w:t>
+              <w:t>Loại bỏ Nội dung trùng lặp · Hợp nhất truy vấn · Cột có Điều kiện</w:t>
             </w:r>
           </w:p>
         </w:tc>
@@ -24326,7 +24816,7 @@
               <w:rPr>
                 <w:sz w:val="18"/>
               </w:rPr>
-              <w:t>Δ · threshold · reconciliation</w:t>
+              <w:t>Remove Duplicates · Merge Queries · Conditional Column</w:t>
             </w:r>
           </w:p>
         </w:tc>
@@ -24343,7 +24833,7 @@
               <w:rPr>
                 <w:sz w:val="18"/>
               </w:rPr>
-              <w:t>thực tế kế toán</w:t>
+              <w:t>Microsoft vi-vn</w:t>
             </w:r>
           </w:p>
         </w:tc>
@@ -24379,7 +24869,7 @@
               <w:rPr>
                 <w:sz w:val="18"/>
               </w:rPr>
-              <w:t>Mô hình Dữ liệu</w:t>
+              <w:t>Các bước Đã áp dụng · Bộ dẫn hướng · Thiết đặt Nguồn Dữ liệu</w:t>
             </w:r>
           </w:p>
         </w:tc>
@@ -24396,7 +24886,7 @@
               <w:rPr>
                 <w:sz w:val="18"/>
               </w:rPr>
-              <w:t>Data Model</w:t>
+              <w:t>Applied Steps · Navigator · Data Source Settings</w:t>
             </w:r>
           </w:p>
         </w:tc>
@@ -24449,7 +24939,7 @@
               <w:rPr>
                 <w:sz w:val="18"/>
               </w:rPr>
-              <w:t>số đo</w:t>
+              <w:t>Kết nối Báo cáo · Bộ lọc Giá trị · Đặt làm tổng (biểu đồ thác nước)</w:t>
             </w:r>
           </w:p>
         </w:tc>
@@ -24466,7 +24956,7 @@
               <w:rPr>
                 <w:sz w:val="18"/>
               </w:rPr>
-              <w:t>measure</w:t>
+              <w:t>Report Connections · Value Filters · Set as total (Waterfall)</w:t>
             </w:r>
           </w:p>
         </w:tc>
@@ -24483,7 +24973,7 @@
               <w:rPr>
                 <w:sz w:val="18"/>
               </w:rPr>
-              <w:t>Microsoft vi-vn (Power Pivot)</w:t>
+              <w:t>Microsoft vi-vn</w:t>
             </w:r>
           </w:p>
         </w:tc>
@@ -24502,7 +24992,7 @@
               <w:rPr>
                 <w:sz w:val="18"/>
               </w:rPr>
-              <w:t>Excel</w:t>
+              <w:t>Dữ liệu</w:t>
             </w:r>
           </w:p>
         </w:tc>
@@ -24519,7 +25009,7 @@
               <w:rPr>
                 <w:sz w:val="18"/>
               </w:rPr>
-              <w:t>mối quan hệ · Dạng xem Sơ đồ · Quản lý Quan hệ</w:t>
+              <w:t>lược đồ hình sao · bảng dữ kiện (còn gọi bảng sự kiện) · bảng chiều</w:t>
             </w:r>
           </w:p>
         </w:tc>
@@ -24536,7 +25026,7 @@
               <w:rPr>
                 <w:sz w:val="18"/>
               </w:rPr>
-              <w:t>relationship · Diagram View · Manage Relationships</w:t>
+              <w:t>star schema · fact table · dimension table</w:t>
             </w:r>
           </w:p>
         </w:tc>
@@ -24553,567 +25043,7 @@
               <w:rPr>
                 <w:sz w:val="18"/>
               </w:rPr>
-              <w:t>Microsoft vi-vn</w:t>
-            </w:r>
-          </w:p>
-        </w:tc>
-      </w:tr>
-      <w:tr>
-        <w:tc>
-          <w:tcPr>
-            <w:tcW w:type="dxa" w:w="1134"/>
-          </w:tcPr>
-          <w:p>
-            <w:pPr>
-              <w:pStyle w:val="Compact"/>
-              <w:spacing w:before="20" w:after="20"/>
-            </w:pPr>
-            <w:r>
-              <w:rPr>
-                <w:sz w:val="18"/>
-              </w:rPr>
-              <w:t>Excel</w:t>
-            </w:r>
-          </w:p>
-        </w:tc>
-        <w:tc>
-          <w:tcPr>
-            <w:tcW w:type="dxa" w:w="3572"/>
-          </w:tcPr>
-          <w:p>
-            <w:pPr>
-              <w:pStyle w:val="Compact"/>
-              <w:spacing w:before="20" w:after="20"/>
-            </w:pPr>
-            <w:r>
-              <w:rPr>
-                <w:sz w:val="18"/>
-              </w:rPr>
-              <w:t>Đánh dấu là Bảng ngày tháng</w:t>
-            </w:r>
-          </w:p>
-        </w:tc>
-        <w:tc>
-          <w:tcPr>
-            <w:tcW w:type="dxa" w:w="3061"/>
-          </w:tcPr>
-          <w:p>
-            <w:pPr>
-              <w:pStyle w:val="Compact"/>
-              <w:spacing w:before="20" w:after="20"/>
-            </w:pPr>
-            <w:r>
-              <w:rPr>
-                <w:sz w:val="18"/>
-              </w:rPr>
-              <w:t>Mark as Date Table</w:t>
-            </w:r>
-          </w:p>
-        </w:tc>
-        <w:tc>
-          <w:tcPr>
-            <w:tcW w:type="dxa" w:w="2154"/>
-          </w:tcPr>
-          <w:p>
-            <w:pPr>
-              <w:pStyle w:val="Compact"/>
-              <w:spacing w:before="20" w:after="20"/>
-            </w:pPr>
-            <w:r>
-              <w:rPr>
-                <w:sz w:val="18"/>
-              </w:rPr>
-              <w:t>Microsoft vi-vn</w:t>
-            </w:r>
-          </w:p>
-        </w:tc>
-      </w:tr>
-      <w:tr>
-        <w:tc>
-          <w:tcPr>
-            <w:tcW w:type="dxa" w:w="1134"/>
-          </w:tcPr>
-          <w:p>
-            <w:pPr>
-              <w:pStyle w:val="Compact"/>
-              <w:spacing w:before="20" w:after="20"/>
-            </w:pPr>
-            <w:r>
-              <w:rPr>
-                <w:sz w:val="18"/>
-              </w:rPr>
-              <w:t>Excel</w:t>
-            </w:r>
-          </w:p>
-        </w:tc>
-        <w:tc>
-          <w:tcPr>
-            <w:tcW w:type="dxa" w:w="3572"/>
-          </w:tcPr>
-          <w:p>
-            <w:pPr>
-              <w:pStyle w:val="Compact"/>
-              <w:spacing w:before="20" w:after="20"/>
-            </w:pPr>
-            <w:r>
-              <w:rPr>
-                <w:sz w:val="18"/>
-              </w:rPr>
-              <w:t>Đóng &amp; Tải Tới · Làm mới Tất cả</w:t>
-            </w:r>
-          </w:p>
-        </w:tc>
-        <w:tc>
-          <w:tcPr>
-            <w:tcW w:type="dxa" w:w="3061"/>
-          </w:tcPr>
-          <w:p>
-            <w:pPr>
-              <w:pStyle w:val="Compact"/>
-              <w:spacing w:before="20" w:after="20"/>
-            </w:pPr>
-            <w:r>
-              <w:rPr>
-                <w:sz w:val="18"/>
-              </w:rPr>
-              <w:t>Close &amp; Load To · Refresh All</w:t>
-            </w:r>
-          </w:p>
-        </w:tc>
-        <w:tc>
-          <w:tcPr>
-            <w:tcW w:type="dxa" w:w="2154"/>
-          </w:tcPr>
-          <w:p>
-            <w:pPr>
-              <w:pStyle w:val="Compact"/>
-              <w:spacing w:before="20" w:after="20"/>
-            </w:pPr>
-            <w:r>
-              <w:rPr>
-                <w:sz w:val="18"/>
-              </w:rPr>
-              <w:t>Microsoft vi-vn</w:t>
-            </w:r>
-          </w:p>
-        </w:tc>
-      </w:tr>
-      <w:tr>
-        <w:tc>
-          <w:tcPr>
-            <w:tcW w:type="dxa" w:w="1134"/>
-          </w:tcPr>
-          <w:p>
-            <w:pPr>
-              <w:pStyle w:val="Compact"/>
-              <w:spacing w:before="20" w:after="20"/>
-            </w:pPr>
-            <w:r>
-              <w:rPr>
-                <w:sz w:val="18"/>
-              </w:rPr>
-              <w:t>Excel</w:t>
-            </w:r>
-          </w:p>
-        </w:tc>
-        <w:tc>
-          <w:tcPr>
-            <w:tcW w:type="dxa" w:w="3572"/>
-          </w:tcPr>
-          <w:p>
-            <w:pPr>
-              <w:pStyle w:val="Compact"/>
-              <w:spacing w:before="20" w:after="20"/>
-            </w:pPr>
-            <w:r>
-              <w:rPr>
-                <w:sz w:val="18"/>
-              </w:rPr>
-              <w:t>Định dạng có Điều kiện · Đường lưới · bổ trợ</w:t>
-            </w:r>
-          </w:p>
-        </w:tc>
-        <w:tc>
-          <w:tcPr>
-            <w:tcW w:type="dxa" w:w="3061"/>
-          </w:tcPr>
-          <w:p>
-            <w:pPr>
-              <w:pStyle w:val="Compact"/>
-              <w:spacing w:before="20" w:after="20"/>
-            </w:pPr>
-            <w:r>
-              <w:rPr>
-                <w:sz w:val="18"/>
-              </w:rPr>
-              <w:t>Conditional Formatting · Gridlines · add-in</w:t>
-            </w:r>
-          </w:p>
-        </w:tc>
-        <w:tc>
-          <w:tcPr>
-            <w:tcW w:type="dxa" w:w="2154"/>
-          </w:tcPr>
-          <w:p>
-            <w:pPr>
-              <w:pStyle w:val="Compact"/>
-              <w:spacing w:before="20" w:after="20"/>
-            </w:pPr>
-            <w:r>
-              <w:rPr>
-                <w:sz w:val="18"/>
-              </w:rPr>
-              <w:t>Microsoft vi-vn</w:t>
-            </w:r>
-          </w:p>
-        </w:tc>
-      </w:tr>
-      <w:tr>
-        <w:tc>
-          <w:tcPr>
-            <w:tcW w:type="dxa" w:w="1134"/>
-          </w:tcPr>
-          <w:p>
-            <w:pPr>
-              <w:pStyle w:val="Compact"/>
-              <w:spacing w:before="20" w:after="20"/>
-            </w:pPr>
-            <w:r>
-              <w:rPr>
-                <w:sz w:val="18"/>
-              </w:rPr>
-              <w:t>Excel</w:t>
-            </w:r>
-          </w:p>
-        </w:tc>
-        <w:tc>
-          <w:tcPr>
-            <w:tcW w:type="dxa" w:w="3572"/>
-          </w:tcPr>
-          <w:p>
-            <w:pPr>
-              <w:pStyle w:val="Compact"/>
-              <w:spacing w:before="20" w:after="20"/>
-            </w:pPr>
-            <w:r>
-              <w:rPr>
-                <w:sz w:val="18"/>
-              </w:rPr>
-              <w:t>giữ tên tiếng Anh</w:t>
-            </w:r>
-          </w:p>
-        </w:tc>
-        <w:tc>
-          <w:tcPr>
-            <w:tcW w:type="dxa" w:w="3061"/>
-          </w:tcPr>
-          <w:p>
-            <w:pPr>
-              <w:pStyle w:val="Compact"/>
-              <w:spacing w:before="20" w:after="20"/>
-            </w:pPr>
-            <w:r>
-              <w:rPr>
-                <w:sz w:val="18"/>
-              </w:rPr>
-              <w:t>PivotTable · PivotChart · Slicer · Power Query · Power Pivot · CUBEVALUE</w:t>
-            </w:r>
-          </w:p>
-        </w:tc>
-        <w:tc>
-          <w:tcPr>
-            <w:tcW w:type="dxa" w:w="2154"/>
-          </w:tcPr>
-          <w:p>
-            <w:pPr>
-              <w:pStyle w:val="Compact"/>
-              <w:spacing w:before="20" w:after="20"/>
-            </w:pPr>
-            <w:r>
-              <w:rPr>
-                <w:sz w:val="18"/>
-              </w:rPr>
-              <w:t>Microsoft vi-vn</w:t>
-            </w:r>
-          </w:p>
-        </w:tc>
-      </w:tr>
-      <w:tr>
-        <w:tc>
-          <w:tcPr>
-            <w:tcW w:type="dxa" w:w="1134"/>
-          </w:tcPr>
-          <w:p>
-            <w:pPr>
-              <w:pStyle w:val="Compact"/>
-              <w:spacing w:before="20" w:after="20"/>
-            </w:pPr>
-            <w:r>
-              <w:rPr>
-                <w:sz w:val="18"/>
-              </w:rPr>
-              <w:t>Excel</w:t>
-            </w:r>
-          </w:p>
-        </w:tc>
-        <w:tc>
-          <w:tcPr>
-            <w:tcW w:type="dxa" w:w="3572"/>
-          </w:tcPr>
-          <w:p>
-            <w:pPr>
-              <w:pStyle w:val="Compact"/>
-              <w:spacing w:before="20" w:after="20"/>
-            </w:pPr>
-            <w:r>
-              <w:rPr>
-                <w:sz w:val="18"/>
-              </w:rPr>
-              <w:t>Loại bỏ Nội dung trùng lặp · Hợp nhất truy vấn · Cột có Điều kiện</w:t>
-            </w:r>
-          </w:p>
-        </w:tc>
-        <w:tc>
-          <w:tcPr>
-            <w:tcW w:type="dxa" w:w="3061"/>
-          </w:tcPr>
-          <w:p>
-            <w:pPr>
-              <w:pStyle w:val="Compact"/>
-              <w:spacing w:before="20" w:after="20"/>
-            </w:pPr>
-            <w:r>
-              <w:rPr>
-                <w:sz w:val="18"/>
-              </w:rPr>
-              <w:t>Remove Duplicates · Merge Queries · Conditional Column</w:t>
-            </w:r>
-          </w:p>
-        </w:tc>
-        <w:tc>
-          <w:tcPr>
-            <w:tcW w:type="dxa" w:w="2154"/>
-          </w:tcPr>
-          <w:p>
-            <w:pPr>
-              <w:pStyle w:val="Compact"/>
-              <w:spacing w:before="20" w:after="20"/>
-            </w:pPr>
-            <w:r>
-              <w:rPr>
-                <w:sz w:val="18"/>
-              </w:rPr>
-              <w:t>Microsoft vi-vn</w:t>
-            </w:r>
-          </w:p>
-        </w:tc>
-      </w:tr>
-      <w:tr>
-        <w:tc>
-          <w:tcPr>
-            <w:tcW w:type="dxa" w:w="1134"/>
-          </w:tcPr>
-          <w:p>
-            <w:pPr>
-              <w:pStyle w:val="Compact"/>
-              <w:spacing w:before="20" w:after="20"/>
-            </w:pPr>
-            <w:r>
-              <w:rPr>
-                <w:sz w:val="18"/>
-              </w:rPr>
-              <w:t>Excel</w:t>
-            </w:r>
-          </w:p>
-        </w:tc>
-        <w:tc>
-          <w:tcPr>
-            <w:tcW w:type="dxa" w:w="3572"/>
-          </w:tcPr>
-          <w:p>
-            <w:pPr>
-              <w:pStyle w:val="Compact"/>
-              <w:spacing w:before="20" w:after="20"/>
-            </w:pPr>
-            <w:r>
-              <w:rPr>
-                <w:sz w:val="18"/>
-              </w:rPr>
-              <w:t>Các bước Đã áp dụng · Bộ dẫn hướng · Thiết đặt Nguồn Dữ liệu</w:t>
-            </w:r>
-          </w:p>
-        </w:tc>
-        <w:tc>
-          <w:tcPr>
-            <w:tcW w:type="dxa" w:w="3061"/>
-          </w:tcPr>
-          <w:p>
-            <w:pPr>
-              <w:pStyle w:val="Compact"/>
-              <w:spacing w:before="20" w:after="20"/>
-            </w:pPr>
-            <w:r>
-              <w:rPr>
-                <w:sz w:val="18"/>
-              </w:rPr>
-              <w:t>Applied Steps · Navigator · Data Source Settings</w:t>
-            </w:r>
-          </w:p>
-        </w:tc>
-        <w:tc>
-          <w:tcPr>
-            <w:tcW w:type="dxa" w:w="2154"/>
-          </w:tcPr>
-          <w:p>
-            <w:pPr>
-              <w:pStyle w:val="Compact"/>
-              <w:spacing w:before="20" w:after="20"/>
-            </w:pPr>
-            <w:r>
-              <w:rPr>
-                <w:sz w:val="18"/>
-              </w:rPr>
-              <w:t>Microsoft vi-vn</w:t>
-            </w:r>
-          </w:p>
-        </w:tc>
-      </w:tr>
-      <w:tr>
-        <w:tc>
-          <w:tcPr>
-            <w:tcW w:type="dxa" w:w="1134"/>
-          </w:tcPr>
-          <w:p>
-            <w:pPr>
-              <w:pStyle w:val="Compact"/>
-              <w:spacing w:before="20" w:after="20"/>
-            </w:pPr>
-            <w:r>
-              <w:rPr>
-                <w:sz w:val="18"/>
-              </w:rPr>
-              <w:t>Excel</w:t>
-            </w:r>
-          </w:p>
-        </w:tc>
-        <w:tc>
-          <w:tcPr>
-            <w:tcW w:type="dxa" w:w="3572"/>
-          </w:tcPr>
-          <w:p>
-            <w:pPr>
-              <w:pStyle w:val="Compact"/>
-              <w:spacing w:before="20" w:after="20"/>
-            </w:pPr>
-            <w:r>
-              <w:rPr>
-                <w:sz w:val="18"/>
-              </w:rPr>
-              <w:t>Kết nối Báo cáo · Bộ lọc Giá trị · Đặt làm tổng (biểu đồ thác nước)</w:t>
-            </w:r>
-          </w:p>
-        </w:tc>
-        <w:tc>
-          <w:tcPr>
-            <w:tcW w:type="dxa" w:w="3061"/>
-          </w:tcPr>
-          <w:p>
-            <w:pPr>
-              <w:pStyle w:val="Compact"/>
-              <w:spacing w:before="20" w:after="20"/>
-            </w:pPr>
-            <w:r>
-              <w:rPr>
-                <w:sz w:val="18"/>
-              </w:rPr>
-              <w:t>Report Connections · Value Filters · Set as total (Waterfall)</w:t>
-            </w:r>
-          </w:p>
-        </w:tc>
-        <w:tc>
-          <w:tcPr>
-            <w:tcW w:type="dxa" w:w="2154"/>
-          </w:tcPr>
-          <w:p>
-            <w:pPr>
-              <w:pStyle w:val="Compact"/>
-              <w:spacing w:before="20" w:after="20"/>
-            </w:pPr>
-            <w:r>
-              <w:rPr>
-                <w:sz w:val="18"/>
-              </w:rPr>
-              <w:t>Microsoft vi-vn</w:t>
-            </w:r>
-          </w:p>
-        </w:tc>
-      </w:tr>
-      <w:tr>
-        <w:tc>
-          <w:tcPr>
-            <w:tcW w:type="dxa" w:w="1134"/>
-          </w:tcPr>
-          <w:p>
-            <w:pPr>
-              <w:pStyle w:val="Compact"/>
-              <w:spacing w:before="20" w:after="20"/>
-            </w:pPr>
-            <w:r>
-              <w:rPr>
-                <w:sz w:val="18"/>
-              </w:rPr>
-              <w:t>Dữ liệu</w:t>
-            </w:r>
-          </w:p>
-        </w:tc>
-        <w:tc>
-          <w:tcPr>
-            <w:tcW w:type="dxa" w:w="3572"/>
-          </w:tcPr>
-          <w:p>
-            <w:pPr>
-              <w:pStyle w:val="Compact"/>
-              <w:spacing w:before="20" w:after="20"/>
-            </w:pPr>
-            <w:r>
-              <w:rPr>
-                <w:sz w:val="18"/>
-              </w:rPr>
-              <w:t>lược đồ hình sao · bảng dữ kiện · bảng chiều</w:t>
-            </w:r>
-          </w:p>
-        </w:tc>
-        <w:tc>
-          <w:tcPr>
-            <w:tcW w:type="dxa" w:w="3061"/>
-          </w:tcPr>
-          <w:p>
-            <w:pPr>
-              <w:pStyle w:val="Compact"/>
-              <w:spacing w:before="20" w:after="20"/>
-            </w:pPr>
-            <w:r>
-              <w:rPr>
-                <w:sz w:val="18"/>
-              </w:rPr>
-              <w:t>star schema · fact table · dimension table</w:t>
-            </w:r>
-          </w:p>
-        </w:tc>
-        <w:tc>
-          <w:tcPr>
-            <w:tcW w:type="dxa" w:w="2154"/>
-          </w:tcPr>
-          <w:p>
-            <w:pPr>
-              <w:pStyle w:val="Compact"/>
-              <w:spacing w:before="20" w:after="20"/>
-            </w:pPr>
-            <w:r>
-              <w:rPr>
-                <w:sz w:val="18"/>
-              </w:rPr>
-              <w:t>giáo trình CSDL / kho dữ liệu</w:t>
+              <w:t>bài giảng mô hình dữ liệu đa chiều; NEU TIKT1122 (kho dữ liệu, tri thức kinh doanh)</w:t>
             </w:r>
           </w:p>
         </w:tc>

</xml_diff>